<commit_message>
txeb motion-brief: complete transcription of FILED-EXAMPLE-motion-brief (fb-w0vj.1)
fb diff --content: G0 FAIL, exemplar 8 pages, ours 7: ours sets more words per page (about 100 ahead by page 6). G2 residuals template-driven only.
</commit_message>
<xml_diff>
--- a/courts/fifth-circuit/texas/federal/bankruptcy-eastern-district/motion-brief/usage/OUTPUT-motion-brief.docx
+++ b/courts/fifth-circuit/texas/federal/bankruptcy-eastern-district/motion-brief/usage/OUTPUT-motion-brief.docx
@@ -154,7 +154,7 @@
               <w:pStyle w:val="CaptionRow"/>
             </w:pPr>
             <w:r>
-              <w:t xml:space="preserve">GREG N. WISNER,</w:t>
+              <w:t xml:space="preserve">GREG N. WISNER and,</w:t>
             </w:r>
           </w:p>
         </w:tc>
@@ -329,7 +329,7 @@
               <w:pStyle w:val="CaptionRow"/>
             </w:pPr>
             <w:r>
-              <w:t xml:space="preserve">Debtors.</w:t>
+              <w:t xml:space="preserve">DEBTORS</w:t>
             </w:r>
           </w:p>
         </w:tc>
@@ -735,14 +735,6 @@
     </w:p>
     <w:p>
       <w:pPr>
-        <w:pStyle w:val="Unnumbered"/>
-      </w:pPr>
-      <w:r>
-        <w:t xml:space="preserve">COMES NOW Defendants Greg N. Wisner and Dana P. Wisner (“Defendants”) file this Defendants’ Motion to Dismiss Count of Complaint Seeking Declaratory Judgment Regarding Discharge and Dischargeabity of a Debt. In support of this Motion, the Defendants state as follows:</w:t>
-      </w:r>
-    </w:p>
-    <w:p>
-      <w:pPr>
         <w:pStyle w:val="Numbered"/>
       </w:pPr>
       <w:r>
@@ -752,291 +744,41 @@
         <w:tab/>
       </w:r>
       <w:r>
-        <w:t xml:space="preserve">Defendants respectfully submit that the Plaintiff’s request for Declaratory Judgment that the Defendants should be denied a discharge under 11 U.S.C. § 727 or that its debt should be declared nondischargeable under 11 U.S.C. §523 should be dismissed under Federal Rule of Civil Procedure 12(b)(1) for lack of subject matter jurisdiction because the request for relief was filed with the court 88 days after the deadline for seeking such relief.</w:t>
-      </w:r>
-    </w:p>
-    <w:p>
-      <w:pPr>
-        <w:pStyle w:val="SectionHeading"/>
-      </w:pPr>
-      <w:r>
-        <w:t xml:space="preserve">BACKGROUND FACTS</w:t>
-      </w:r>
-    </w:p>
-    <w:p>
-      <w:pPr>
-        <w:pStyle w:val="Numbered"/>
-      </w:pPr>
-      <w:r>
-        <w:t xml:space="preserve">2.</w:t>
-      </w:r>
-      <w:r>
-        <w:tab/>
-      </w:r>
-      <w:r>
-        <w:t xml:space="preserve">The Defendants filed a voluntary petition for relief under chapter 7 on August 5, 2021 in this district. The Debtor listed Ballout Real Estate, LLC (the “Plaintiff”) as a creditor on its service list and schedules filed on the same day as its voluntary Petition. At the time the bankruptcy case was commenced, the Bankruptcy Noticing Center (“BNC”) sent the Notice of Chapter 7 Bankruptcy to creditors of the Debtors, including the Plaintiff. The BNC filed its Certificate of Notice showing service on Ballout Real Estate on August 8, 2021 [Docket #4 Main Bankruptcy Case]. Set forth in the Notice of Chapter 7 Bankruptcy was notice that the deadline to object to discharge or to challenge whether certain debts are dischargeable was November 1, 2021 (the “727/523 deadline”)</w:t>
-      </w:r>
-    </w:p>
-    <w:p>
-      <w:pPr>
-        <w:pStyle w:val="Numbered"/>
-      </w:pPr>
-      <w:r>
-        <w:t xml:space="preserve">3.</w:t>
-      </w:r>
-      <w:r>
-        <w:tab/>
-      </w:r>
-      <w:r>
-        <w:t xml:space="preserve">No request to extend the 727/523 deadline was filed in the case by any party.</w:t>
-      </w:r>
-    </w:p>
-    <w:p>
-      <w:pPr>
-        <w:pStyle w:val="Numbered"/>
-      </w:pPr>
-      <w:r>
-        <w:t xml:space="preserve">4.</w:t>
-      </w:r>
-      <w:r>
-        <w:tab/>
-      </w:r>
-      <w:r>
-        <w:t xml:space="preserve">The Plaintiff made its first appearance in the main bankruptcy case on September 22, 2021 [Docket #19 Main Bankruptcy Case].</w:t>
-      </w:r>
-    </w:p>
-    <w:p>
-      <w:pPr>
-        <w:pStyle w:val="Numbered"/>
-      </w:pPr>
-      <w:r>
-        <w:t xml:space="preserve">5.</w:t>
-      </w:r>
-      <w:r>
-        <w:tab/>
-      </w:r>
-      <w:r>
-        <w:t xml:space="preserve">On November 1, 2021 the Plaintiff filed its Plaintiff’s Original Complaint (Adv. Dkt #1] in this adversary (the “Original Complaint”). A true and correct copy of the Plaintiff’s Original Complaint, without exhibits, is attached hereto as Exhibit 1. In its Original Complaint, the Plaintiff sought an award of damages for Count 1 - Theft-Civil Liability Act; Count 2 – Conversion; Count 3 – Unjust Enrichment/ Money Had and Received; Count 4 – Fraud, Fraud by Concealment, Fraud through Misrepresentation, and Fraud by Non-Disclosure; Count 5 – Civil Conspiracy and Aiding and Abetting; Count 6 – Accounting; Count 7 Exemplary Damages; Count 8 – Attorney’s Fees; Count 9 – Request for Declaratory Judgment.</w:t>
-      </w:r>
-    </w:p>
-    <w:p>
-      <w:pPr>
-        <w:pStyle w:val="Numbered"/>
-      </w:pPr>
-      <w:r>
-        <w:t xml:space="preserve">6.</w:t>
-      </w:r>
-      <w:r>
-        <w:tab/>
-      </w:r>
-      <w:r>
-        <w:t xml:space="preserve">In its Request for Declaratory Judgment, the Plaintiff requested:</w:t>
-      </w:r>
-    </w:p>
-    <w:p>
-      <w:pPr>
-        <w:pStyle w:val="BlockQuote"/>
-      </w:pPr>
-      <w:r>
-        <w:t xml:space="preserve">“…. declaratory judgment to resolve an existing controversy concerning the parties’ respective rights and obligations regarding the Defendant’s Property. Defendants have taken the position in the underlying bankruptcy proceeding that the Defendant’s Property is an exempt asset and Defendants are seeking to avoid and cancel any judgment lien arising from the judgment Patriot Concrete obtained against Greg Wisner.</w:t>
-      </w:r>
-    </w:p>
-    <w:p>
-      <w:pPr>
-        <w:pStyle w:val="BlockQuote"/>
-      </w:pPr>
-      <w:r>
-        <w:t xml:space="preserve">Plaintiff has shown herein that the Defendant’s Property was obtained through ill-gotten gains received by Defendants through their fraudulent and unlawful scheme set forth in detail herein.</w:t>
-      </w:r>
-    </w:p>
-    <w:p>
-      <w:pPr>
-        <w:pStyle w:val="BlockQuote"/>
-      </w:pPr>
-      <w:r>
-        <w:t xml:space="preserve">Given the controversy between the parties regarding their respective rights and obligations concerning the exempt status of the Defendant’s Property, Plaintiff seeks declaratory judgment that Defendant’s Property is not an exempt asset and, therefore, Defendants are not entitled to avoid or cancel any judgment liens against such property.”</w:t>
-      </w:r>
-    </w:p>
-    <w:p>
-      <w:pPr>
-        <w:pStyle w:val="Numbered"/>
-      </w:pPr>
-      <w:r>
-        <w:t xml:space="preserve">7.</w:t>
-      </w:r>
-      <w:r>
-        <w:tab/>
-      </w:r>
-      <w:r>
-        <w:t xml:space="preserve">At the Conclusion of the Original Complaint, the Plaintiff requested that it be awarded judgment against Defendants for the following relief:</w:t>
-      </w:r>
-    </w:p>
-    <w:p>
-      <w:pPr>
-        <w:pStyle w:val="ReliefItem"/>
-      </w:pPr>
-      <w:r>
-        <w:t xml:space="preserve">1. Plaintiff’s actual damages;</w:t>
-      </w:r>
-    </w:p>
-    <w:p>
-      <w:pPr>
-        <w:pStyle w:val="ReliefItem"/>
-      </w:pPr>
-      <w:r>
-        <w:t xml:space="preserve">2. Plaintiff’s reasonable and necessary attorney’s fees;</w:t>
-      </w:r>
-    </w:p>
-    <w:p>
-      <w:pPr>
-        <w:pStyle w:val="ReliefItem"/>
-      </w:pPr>
-      <w:r>
-        <w:t xml:space="preserve">3. Exemplary damages pursuant to Chapter 41 of the Texas Civil Practice and Remedies Code;</w:t>
-      </w:r>
-    </w:p>
-    <w:p>
-      <w:pPr>
-        <w:pStyle w:val="ReliefItem"/>
-      </w:pPr>
-      <w:r>
-        <w:t xml:space="preserve">4. Pre-judgment and post-judgment interest at the maximum rates allowed by law;</w:t>
-      </w:r>
-    </w:p>
-    <w:p>
-      <w:pPr>
-        <w:pStyle w:val="ReliefItem"/>
-      </w:pPr>
-      <w:r>
-        <w:t xml:space="preserve">5. Declaratory judgment as requested herein; and</w:t>
-      </w:r>
-    </w:p>
-    <w:p>
-      <w:pPr>
-        <w:pStyle w:val="ReliefItem"/>
-      </w:pPr>
-      <w:r>
-        <w:t xml:space="preserve">6. Such other and further relief, at law or in equity, to which Plaintiff may be justly entitled.</w:t>
-      </w:r>
-    </w:p>
-    <w:p>
-      <w:pPr>
-        <w:pStyle w:val="Numbered"/>
-      </w:pPr>
-      <w:r>
-        <w:t xml:space="preserve">8.</w:t>
-      </w:r>
-      <w:r>
-        <w:tab/>
-      </w:r>
-      <w:r>
-        <w:t xml:space="preserve">The Plaintiff did not seek any relief in its Count for Declaratory Relief in the Original Complaint for the determination of the Debtors discharge or dischargeability of its claim under Section 727/523 nor in any other count in its Original Complaint. The Original Complaint is entirely devoid of any request to deny the Defendant’s a discharge or to determine the dischargeability of the Plaintiff’s claim.</w:t>
-      </w:r>
-    </w:p>
-    <w:p>
-      <w:pPr>
-        <w:pStyle w:val="Numbered"/>
-      </w:pPr>
-      <w:r>
-        <w:t xml:space="preserve">9.</w:t>
-      </w:r>
-      <w:r>
-        <w:tab/>
-      </w:r>
-      <w:r>
-        <w:t xml:space="preserve">When the Original Complaint was filed, the court clerk appropriately classified the adversary proceeding as “02. Other (e.g. other actions that would have been brought in state court if unrelated to bankruptcy). 14. Recovery of money property – other.”</w:t>
-      </w:r>
-    </w:p>
-    <w:p>
-      <w:pPr>
-        <w:pStyle w:val="Numbered"/>
-      </w:pPr>
-      <w:r>
-        <w:t xml:space="preserve">10.</w:t>
-      </w:r>
-      <w:r>
-        <w:tab/>
-      </w:r>
-      <w:r>
-        <w:t xml:space="preserve">No summons was issued related to the Original Complaint.</w:t>
-      </w:r>
-    </w:p>
-    <w:p>
-      <w:pPr>
-        <w:pStyle w:val="Numbered"/>
-      </w:pPr>
-      <w:r>
-        <w:t xml:space="preserve">11.</w:t>
-      </w:r>
-      <w:r>
-        <w:tab/>
-      </w:r>
-      <w:r>
-        <w:t xml:space="preserve">On November 22, 2021, the Plaintiff filed its Amended Complaint [Adv. Dkt. #2]. No request for relief under Section 727/523 was made in the Plaintiff’s Amended Complaint. A true and correct copy of Plaintiff’s Amended Complaint is attached hereto as Exhibit 2. Summons were issued for the Plaintiff’s Amended Complaint on January 20, 2022 but were never served on the Defendants and no return of service filed with the court.</w:t>
-      </w:r>
-    </w:p>
-    <w:p>
-      <w:pPr>
-        <w:pStyle w:val="Numbered"/>
-      </w:pPr>
-      <w:r>
-        <w:t xml:space="preserve">12.</w:t>
-      </w:r>
-      <w:r>
-        <w:tab/>
-      </w:r>
-      <w:r>
-        <w:t xml:space="preserve">On January 13, 2022 the Defendants were issued an Order of Discharge in the main bankruptcy case [Docket # 67 Main Bankruptcy Case].</w:t>
-      </w:r>
-    </w:p>
-    <w:p>
-      <w:pPr>
-        <w:pStyle w:val="Numbered"/>
-      </w:pPr>
-      <w:r>
-        <w:t xml:space="preserve">13.</w:t>
-      </w:r>
-      <w:r>
-        <w:tab/>
-      </w:r>
-      <w:r>
-        <w:t xml:space="preserve">On January 27, 2022, the Plaintiff filed its Second Amended Complaint [Adv. Dkt. #6]. The Plaintiff did not include any additional counts in its complaint, but for the first time included, in its Request for Declaratory Judgment, a request that its debt not be discharged under Section 523. The Plaintiff also, for the first time, included a request for declaratory judgment that the Debtors should be denied a discharge under Section 727. A true and correct copy of the Plaintiff’s Second Amended Complaint is attached as Exhibit 3.</w:t>
-      </w:r>
-    </w:p>
-    <w:p>
-      <w:pPr>
-        <w:pStyle w:val="Numbered"/>
-      </w:pPr>
-      <w:r>
-        <w:t xml:space="preserve">14.</w:t>
-      </w:r>
-      <w:r>
-        <w:tab/>
-      </w:r>
-      <w:r>
-        <w:t xml:space="preserve">Summons for the Second Amended Complaint were issued on January 28, 2022. A return of serve was returned on January 31, 2022.</w:t>
-      </w:r>
-    </w:p>
-    <w:p>
-      <w:pPr>
-        <w:pStyle w:val="SectionHeading"/>
-      </w:pPr>
-      <w:r>
-        <w:t xml:space="preserve">STANDARD</w:t>
-      </w:r>
-    </w:p>
-    <w:p>
-      <w:pPr>
-        <w:pStyle w:val="Numbered"/>
-      </w:pPr>
-      <w:r>
-        <w:t xml:space="preserve">15.</w:t>
-      </w:r>
-      <w:r>
-        <w:tab/>
-      </w:r>
-      <w:r>
-        <w:t xml:space="preserve">A motion to dismiss under Rule 12(b)(1) challenges the subject matter jurisdiction of the Court.</w:t>
+        <w:t xml:space="preserve">&lt;!– unnumbered –&gt;</w:t>
+      </w:r>
+      <w:r>
+        <w:t xml:space="preserve"> </w:t>
+      </w:r>
+      <w:r>
+        <w:rPr>
+          <w:b/>
+          <w:bCs/>
+        </w:rPr>
+        <w:t xml:space="preserve">COMES NOW</w:t>
+      </w:r>
+      <w:r>
+        <w:t xml:space="preserve"> </w:t>
+      </w:r>
+      <w:r>
+        <w:t xml:space="preserve">Defendants Greg N. Wisner and Dana P. Wisner</w:t>
+      </w:r>
+      <w:r>
+        <w:t xml:space="preserve"> </w:t>
+      </w:r>
+      <w:r>
+        <w:rPr>
+          <w:b/>
+          <w:bCs/>
+          <w:i/>
+          <w:iCs/>
+        </w:rPr>
+        <w:t xml:space="preserve">("Defendants")</w:t>
+      </w:r>
+      <w:r>
+        <w:t xml:space="preserve"> </w:t>
+      </w:r>
+      <w:r>
+        <w:t xml:space="preserve">file this</w:t>
       </w:r>
       <w:r>
         <w:t xml:space="preserve"> </w:t>
@@ -1046,10 +788,455 @@
           <w:i/>
           <w:iCs/>
         </w:rPr>
-        <w:t xml:space="preserve">Ramming v. United States</w:t>
-      </w:r>
-      <w:r>
-        <w:t xml:space="preserve">, 281 F.3d 158, 161 (5th Cir.2001). The party asserting jurisdiction bears the burden of proving its existence.</w:t>
+        <w:t xml:space="preserve">Defendants’ Motion to Dismiss Count of Complaint Seeking Declaratory Judgment Regarding Discharge and Dischargeabity of a Debt.</w:t>
+      </w:r>
+      <w:r>
+        <w:t xml:space="preserve"> </w:t>
+      </w:r>
+      <w:r>
+        <w:t xml:space="preserve">In support of this Motion, the Defendants state as follows:</w:t>
+      </w:r>
+    </w:p>
+    <w:p>
+      <w:pPr>
+        <w:pStyle w:val="Numbered"/>
+      </w:pPr>
+      <w:r>
+        <w:t xml:space="preserve">2.</w:t>
+      </w:r>
+      <w:r>
+        <w:tab/>
+      </w:r>
+      <w:r>
+        <w:t xml:space="preserve">Defendants respectfully submit that the Plaintiff’s request for Declaratory Judgment that the Defendants should be denied a discharge under 11 U.S.C. § 727 or that its debt should be declared nondischargeable under 11 U.S.C. §523 should be dismissed under Federal Rule of Civil Procedure 12(b)(1) for lack of subject matter jurisdiction because the request for relief was filed with the court 88 days after the deadline for seeking such relief.</w:t>
+      </w:r>
+    </w:p>
+    <w:p>
+      <w:pPr>
+        <w:pStyle w:val="SectionHeading"/>
+      </w:pPr>
+      <w:r>
+        <w:t xml:space="preserve">BACKGROUND FACTS</w:t>
+      </w:r>
+    </w:p>
+    <w:p>
+      <w:pPr>
+        <w:pStyle w:val="Numbered"/>
+      </w:pPr>
+      <w:r>
+        <w:t xml:space="preserve">3.</w:t>
+      </w:r>
+      <w:r>
+        <w:tab/>
+      </w:r>
+      <w:r>
+        <w:t xml:space="preserve">The Defendants filed a voluntary petition for relief under chapter 7 on August 5, 2021 in this district. The Debtor listed Ballout Real Estate, LLC (the “</w:t>
+      </w:r>
+      <w:r>
+        <w:rPr>
+          <w:b/>
+          <w:bCs/>
+          <w:i/>
+          <w:iCs/>
+        </w:rPr>
+        <w:t xml:space="preserve">Plaintiff</w:t>
+      </w:r>
+      <w:r>
+        <w:t xml:space="preserve">”) as a creditor on its service list and schedules filed on the same day as its voluntary Petition. At the time the bankruptcy case was commenced, the Bankruptcy Noticing Center (“</w:t>
+      </w:r>
+      <w:r>
+        <w:rPr>
+          <w:i/>
+          <w:iCs/>
+        </w:rPr>
+        <w:t xml:space="preserve">BNC</w:t>
+      </w:r>
+      <w:r>
+        <w:t xml:space="preserve">”) sent the Notice of Chapter 7 Bankruptcy Case to creditors of the Debtors, including the Plaintiff. The BNC filed its Certificate of Notice showing service on Ballout Real Estate on August 8, 2021 [</w:t>
+      </w:r>
+      <w:r>
+        <w:rPr>
+          <w:i/>
+          <w:iCs/>
+        </w:rPr>
+        <w:t xml:space="preserve">Docket #4 Main Bankruptcy Case</w:t>
+      </w:r>
+      <w:r>
+        <w:t xml:space="preserve">]. Set forth in the Notice of Chapter 7 Bankruptcy was notice that the deadline to object to discharge or to challenge whether certain debts are dischargeable was</w:t>
+      </w:r>
+      <w:r>
+        <w:t xml:space="preserve"> </w:t>
+      </w:r>
+      <w:r>
+        <w:rPr>
+          <w:b/>
+          <w:bCs/>
+        </w:rPr>
+        <w:t xml:space="preserve">November 1, 2021</w:t>
+      </w:r>
+      <w:r>
+        <w:t xml:space="preserve"> </w:t>
+      </w:r>
+      <w:r>
+        <w:t xml:space="preserve">(the “</w:t>
+      </w:r>
+      <w:r>
+        <w:rPr>
+          <w:i/>
+          <w:iCs/>
+        </w:rPr>
+        <w:t xml:space="preserve">727/523 deadline</w:t>
+      </w:r>
+      <w:r>
+        <w:t xml:space="preserve">”)</w:t>
+      </w:r>
+    </w:p>
+    <w:p>
+      <w:pPr>
+        <w:pStyle w:val="Numbered"/>
+      </w:pPr>
+      <w:r>
+        <w:t xml:space="preserve">4.</w:t>
+      </w:r>
+      <w:r>
+        <w:tab/>
+      </w:r>
+      <w:r>
+        <w:t xml:space="preserve">No request to extend the 727/523 deadline was filed in the case by any party.</w:t>
+      </w:r>
+    </w:p>
+    <w:p>
+      <w:pPr>
+        <w:pStyle w:val="Numbered"/>
+      </w:pPr>
+      <w:r>
+        <w:t xml:space="preserve">5.</w:t>
+      </w:r>
+      <w:r>
+        <w:tab/>
+      </w:r>
+      <w:r>
+        <w:t xml:space="preserve">The Plaintiff made its first appearance in the main bankruptcy case on September 22, 2021 [</w:t>
+      </w:r>
+      <w:r>
+        <w:rPr>
+          <w:i/>
+          <w:iCs/>
+        </w:rPr>
+        <w:t xml:space="preserve">Docket #19 Main Bankruptcy Case</w:t>
+      </w:r>
+      <w:r>
+        <w:t xml:space="preserve">].</w:t>
+      </w:r>
+    </w:p>
+    <w:p>
+      <w:pPr>
+        <w:pStyle w:val="Numbered"/>
+      </w:pPr>
+      <w:r>
+        <w:t xml:space="preserve">6.</w:t>
+      </w:r>
+      <w:r>
+        <w:tab/>
+      </w:r>
+      <w:r>
+        <w:t xml:space="preserve">On November 1, 2021 the Plaintiff filed its Plaintiff’s Original Complaint (</w:t>
+      </w:r>
+      <w:r>
+        <w:rPr>
+          <w:i/>
+          <w:iCs/>
+        </w:rPr>
+        <w:t xml:space="preserve">Adv. Dkt #1</w:t>
+      </w:r>
+      <w:r>
+        <w:t xml:space="preserve">] in this adversary (the “</w:t>
+      </w:r>
+      <w:r>
+        <w:rPr>
+          <w:i/>
+          <w:iCs/>
+        </w:rPr>
+        <w:t xml:space="preserve">Original Complaint</w:t>
+      </w:r>
+      <w:r>
+        <w:t xml:space="preserve">”). A true and correct copy of the Plaintiff’s Original Complaint, without exhibits, is attached hereto as Exhibit 1. In its Original Complaint, the Plaintiff sought an award of damages for Count 1 - Theft-Civil Liability Act; Count 2 – Conversion; Count 3 – Unjust Enrichment/ Money Had and Received; Count 4 – Fraud, Fraud by Concealment, Fraud through Misrepresentation, and Fraud by Non-Disclosure; Count 5 – Civil Conspiracy and Aiding and Abetting; Count 6 – Accounting; Count 7 Exemplary Damages; Count 8 – Attorney’s Fees; Count 9 – Request for Declaratory Judgment.</w:t>
+      </w:r>
+    </w:p>
+    <w:p>
+      <w:pPr>
+        <w:pStyle w:val="Numbered"/>
+      </w:pPr>
+      <w:r>
+        <w:t xml:space="preserve">7.</w:t>
+      </w:r>
+      <w:r>
+        <w:tab/>
+      </w:r>
+      <w:r>
+        <w:t xml:space="preserve">In its Request for Declaratory Judgment, the Plaintiff requested:</w:t>
+      </w:r>
+    </w:p>
+    <w:p>
+      <w:pPr>
+        <w:pStyle w:val="BlockQuote"/>
+      </w:pPr>
+      <w:r>
+        <w:t xml:space="preserve">“…. declaratory judgment to resolve an existing controversy concerning the parties’ respective rights and obligations regarding the Defendant’s Property. Defendants have taken the position in the underlying bankruptcy proceeding that the Defendant’s Property is an exempt asset and Defendants are seeking to avoid and cancel any judgment lien arising from the judgment Patriot Concrete obtained against Greg Wisner.</w:t>
+      </w:r>
+    </w:p>
+    <w:p>
+      <w:pPr>
+        <w:pStyle w:val="BlockQuote"/>
+      </w:pPr>
+      <w:r>
+        <w:t xml:space="preserve">Plaintiff has shown herein that the Defendant’s Property was obtained through ill-gotten gains received by Defendants through their fraudulent and unlawful scheme set forth in detail herein.</w:t>
+      </w:r>
+    </w:p>
+    <w:p>
+      <w:pPr>
+        <w:pStyle w:val="BlockQuote"/>
+      </w:pPr>
+      <w:r>
+        <w:t xml:space="preserve">Given the controversy between the parties regarding their respective rights and obligations concerning the exempt status of the Defendant’s Property, Plaintiff seeks declaratory judgment that Defendant’s Property is not an exempt asset and, therefore, Defendants are not entitled to avoid or cancel any judgment liens against such property.”</w:t>
+      </w:r>
+    </w:p>
+    <w:p>
+      <w:pPr>
+        <w:pStyle w:val="Numbered"/>
+      </w:pPr>
+      <w:r>
+        <w:t xml:space="preserve">8.</w:t>
+      </w:r>
+      <w:r>
+        <w:tab/>
+      </w:r>
+      <w:r>
+        <w:t xml:space="preserve">At the Conclusion of the Original Complaint, the Plaintiff requested that it be awarded judgment against Defendants for the following relief:</w:t>
+      </w:r>
+    </w:p>
+    <w:p>
+      <w:pPr>
+        <w:pStyle w:val="ReliefItem"/>
+      </w:pPr>
+      <w:r>
+        <w:t xml:space="preserve">1. Plaintiff’s actual damages;</w:t>
+      </w:r>
+    </w:p>
+    <w:p>
+      <w:pPr>
+        <w:pStyle w:val="ReliefItem"/>
+      </w:pPr>
+      <w:r>
+        <w:t xml:space="preserve">2. Plaintiff’s reasonable and necessary attorney’s fees;</w:t>
+      </w:r>
+    </w:p>
+    <w:p>
+      <w:pPr>
+        <w:pStyle w:val="ReliefItem"/>
+      </w:pPr>
+      <w:r>
+        <w:t xml:space="preserve">3. Exemplary damages pursuant to Chapter 41 of the Texas Civil Practice and Remedies Code;</w:t>
+      </w:r>
+    </w:p>
+    <w:p>
+      <w:pPr>
+        <w:pStyle w:val="ReliefItem"/>
+      </w:pPr>
+      <w:r>
+        <w:t xml:space="preserve">4. Pre-judgment and post-judgment interest at the maximum rates allowed by law;</w:t>
+      </w:r>
+    </w:p>
+    <w:p>
+      <w:pPr>
+        <w:pStyle w:val="ReliefItem"/>
+      </w:pPr>
+      <w:r>
+        <w:t xml:space="preserve">5. Declaratory judgment as requested herein; and</w:t>
+      </w:r>
+    </w:p>
+    <w:p>
+      <w:pPr>
+        <w:pStyle w:val="ReliefItem"/>
+      </w:pPr>
+      <w:r>
+        <w:t xml:space="preserve">6. Such other and further relief, at law or in equity, to which Plaintiff may be justly entitled.</w:t>
+      </w:r>
+    </w:p>
+    <w:p>
+      <w:pPr>
+        <w:pStyle w:val="Numbered"/>
+      </w:pPr>
+      <w:r>
+        <w:t xml:space="preserve">9.</w:t>
+      </w:r>
+      <w:r>
+        <w:tab/>
+      </w:r>
+      <w:r>
+        <w:t xml:space="preserve">The Plaintiff did not seek any relief in its Count for Declaratory Relief in the Original Complaint for the determination of the Debtors discharge or dischargeability of its claim under Section 727/523 nor in any other count in its Original Complaint. The Original Complaint is entirely devoid of any request to deny the Defendant’s a discharge or to determine the dischargeability of the Plaintiff’s claim.</w:t>
+      </w:r>
+    </w:p>
+    <w:p>
+      <w:pPr>
+        <w:pStyle w:val="Numbered"/>
+      </w:pPr>
+      <w:r>
+        <w:t xml:space="preserve">10.</w:t>
+      </w:r>
+      <w:r>
+        <w:tab/>
+      </w:r>
+      <w:r>
+        <w:t xml:space="preserve">When the Original Complaint was filed, the court clerk appropriately classified the adversary proceeding as “</w:t>
+      </w:r>
+      <w:r>
+        <w:rPr>
+          <w:i/>
+          <w:iCs/>
+        </w:rPr>
+        <w:t xml:space="preserve">02. Other (e.g. other actions that would have been brought in state court if unrelated to bankruptcy). 14. Recovery of money property – other.</w:t>
+      </w:r>
+      <w:r>
+        <w:t xml:space="preserve">”_</w:t>
+      </w:r>
+    </w:p>
+    <w:p>
+      <w:pPr>
+        <w:pStyle w:val="Numbered"/>
+      </w:pPr>
+      <w:r>
+        <w:t xml:space="preserve">11.</w:t>
+      </w:r>
+      <w:r>
+        <w:tab/>
+      </w:r>
+      <w:r>
+        <w:t xml:space="preserve">No summons was issued related to the Original Complaint.</w:t>
+      </w:r>
+    </w:p>
+    <w:p>
+      <w:pPr>
+        <w:pStyle w:val="Numbered"/>
+      </w:pPr>
+      <w:r>
+        <w:t xml:space="preserve">12.</w:t>
+      </w:r>
+      <w:r>
+        <w:tab/>
+      </w:r>
+      <w:r>
+        <w:t xml:space="preserve">On November 22, 2021, the Plaintiff filed its Amended Complaint [</w:t>
+      </w:r>
+      <w:r>
+        <w:rPr>
+          <w:i/>
+          <w:iCs/>
+        </w:rPr>
+        <w:t xml:space="preserve">Adv. Dkt. #2</w:t>
+      </w:r>
+      <w:r>
+        <w:t xml:space="preserve">]. No request for relief under Section 727/523 was made in the Plaintiff’s Amended Complaint. A true and correct copy of Plaintiff’s Amended Complaint is attached hereto as Exhibit 2. Summons were issued for the Plaintiff’s Amended Complaint on January 20, 2022 but were never served on the Defendants and no return of service filed with the court.</w:t>
+      </w:r>
+    </w:p>
+    <w:p>
+      <w:pPr>
+        <w:pStyle w:val="Numbered"/>
+      </w:pPr>
+      <w:r>
+        <w:t xml:space="preserve">13.</w:t>
+      </w:r>
+      <w:r>
+        <w:tab/>
+      </w:r>
+      <w:r>
+        <w:t xml:space="preserve">On January 13, 2022 the Defendants were issued an Order of Discharge in the main bankruptcy case [</w:t>
+      </w:r>
+      <w:r>
+        <w:rPr>
+          <w:i/>
+          <w:iCs/>
+        </w:rPr>
+        <w:t xml:space="preserve">Docket # 67 Main Bankruptcy Case</w:t>
+      </w:r>
+      <w:r>
+        <w:t xml:space="preserve">].</w:t>
+      </w:r>
+    </w:p>
+    <w:p>
+      <w:pPr>
+        <w:pStyle w:val="Numbered"/>
+      </w:pPr>
+      <w:r>
+        <w:t xml:space="preserve">14.</w:t>
+      </w:r>
+      <w:r>
+        <w:tab/>
+      </w:r>
+      <w:r>
+        <w:t xml:space="preserve">On January 27, 2022, the Plaintiff filed its Second Amended Complaint [</w:t>
+      </w:r>
+      <w:r>
+        <w:rPr>
+          <w:i/>
+          <w:iCs/>
+        </w:rPr>
+        <w:t xml:space="preserve">Adv. Dkt. #6</w:t>
+      </w:r>
+      <w:r>
+        <w:t xml:space="preserve">]. The Plaintiff did not include any additional counts in its complaint, but for the first time included, in its Request for Declaratory Judgment, a request that its debt not be discharged under Section 523. The Plaintiff also, for the first time, included a request for declaratory judgment that the Debtors should be denied a discharge under Section 727. A true and correct copy of the Plaintiff’s Second Amended Complaint is attached as Exhibit 3.</w:t>
+      </w:r>
+    </w:p>
+    <w:p>
+      <w:pPr>
+        <w:pStyle w:val="Numbered"/>
+      </w:pPr>
+      <w:r>
+        <w:t xml:space="preserve">15.</w:t>
+      </w:r>
+      <w:r>
+        <w:tab/>
+      </w:r>
+      <w:r>
+        <w:t xml:space="preserve">Summons for the Second Amended Complaint were issued on January 28, 2022. A return of serve was returned on January 31, 2022.</w:t>
+      </w:r>
+    </w:p>
+    <w:p>
+      <w:pPr>
+        <w:pStyle w:val="SectionHeading"/>
+      </w:pPr>
+      <w:r>
+        <w:t xml:space="preserve">STANDARD</w:t>
+      </w:r>
+    </w:p>
+    <w:p>
+      <w:pPr>
+        <w:pStyle w:val="Numbered"/>
+      </w:pPr>
+      <w:r>
+        <w:t xml:space="preserve">16.</w:t>
+      </w:r>
+      <w:r>
+        <w:tab/>
+      </w:r>
+      <w:r>
+        <w:t xml:space="preserve">A motion to dismiss under Rule 12(b)(1) challenges the subject matter jurisdiction of the Court.</w:t>
+      </w:r>
+      <w:r>
+        <w:t xml:space="preserve"> </w:t>
+      </w:r>
+      <w:r>
+        <w:rPr>
+          <w:i/>
+          <w:iCs/>
+        </w:rPr>
+        <w:t xml:space="preserve">Ramming v. United States,</w:t>
+      </w:r>
+      <w:r>
+        <w:t xml:space="preserve"> </w:t>
+      </w:r>
+      <w:r>
+        <w:t xml:space="preserve">281 F.3d 158, 161 (5th Cir.2001). The party asserting jurisdiction bears the burden of proving its existence.</w:t>
       </w:r>
       <w:r>
         <w:t xml:space="preserve"> </w:t>
@@ -1075,10 +1262,13 @@
           <w:i/>
           <w:iCs/>
         </w:rPr>
-        <w:t xml:space="preserve">Menchaca v. Chrysler Credit Corp.</w:t>
-      </w:r>
-      <w:r>
-        <w:t xml:space="preserve">, 613 F.2d 507, 511 (5th Cir.1980)). A case is properly dismissed under Rule 12(b)(1) when the Court lacks the statutory or constitutional power to adjudicate the case.</w:t>
+        <w:t xml:space="preserve">Menchaca v. Chrysler Credit Corp.,</w:t>
+      </w:r>
+      <w:r>
+        <w:t xml:space="preserve"> </w:t>
+      </w:r>
+      <w:r>
+        <w:t xml:space="preserve">613 F.2d 507, 511 (5th Cir.1980)). A case is properly dismissed under Rule 12(b)(1) when the Court lacks the statutory or constitutional power to adjudicate the case.</w:t>
       </w:r>
       <w:r>
         <w:t xml:space="preserve"> </w:t>
@@ -1088,10 +1278,13 @@
           <w:i/>
           <w:iCs/>
         </w:rPr>
-        <w:t xml:space="preserve">Cleancoalition v. TXU Power</w:t>
-      </w:r>
-      <w:r>
-        <w:t xml:space="preserve">, 536 F.3d 469, 473 (5th Cir.2008) (citing</w:t>
+        <w:t xml:space="preserve">Cleancoalition v. TXU Power,</w:t>
+      </w:r>
+      <w:r>
+        <w:t xml:space="preserve"> </w:t>
+      </w:r>
+      <w:r>
+        <w:t xml:space="preserve">536 F.3d 469, 473 (5th Cir.2008) (citing</w:t>
       </w:r>
       <w:r>
         <w:t xml:space="preserve"> </w:t>
@@ -1101,10 +1294,13 @@
           <w:i/>
           <w:iCs/>
         </w:rPr>
-        <w:t xml:space="preserve">Home Builders Ass’n of Miss., Inc. v. City of Madison</w:t>
-      </w:r>
-      <w:r>
-        <w:t xml:space="preserve">, 143 F.3d 1006, 1010 (5th Cir.1998)). In deciding a Rule 12(b)(1) motion, the Court may consider: “(1) the complaint alone; (2) the complaint supplemented by undisputed facts evidenced in the record; or (3) the complaint supplemented by undisputed facts plus the court’s resolution of disputed facts.”</w:t>
+        <w:t xml:space="preserve">Home Builders Ass'n of Miss., Inc. v. City of Madison,</w:t>
+      </w:r>
+      <w:r>
+        <w:t xml:space="preserve"> </w:t>
+      </w:r>
+      <w:r>
+        <w:t xml:space="preserve">143 F.3d 1006, 1010 (5th Cir.1998)). In deciding a Rule 12(b)(1) motion, the Court may consider: “(1) the complaint alone; (2) the complaint supplemented by undisputed facts evidenced in the record; or (3) the complaint supplemented by undisputed facts plus the court's resolution of disputed facts.”</w:t>
       </w:r>
       <w:r>
         <w:t xml:space="preserve"> </w:t>
@@ -1114,10 +1310,13 @@
           <w:i/>
           <w:iCs/>
         </w:rPr>
-        <w:t xml:space="preserve">Robinson v. TCI/US West Comm’cns Inc.</w:t>
-      </w:r>
-      <w:r>
-        <w:t xml:space="preserve">, 117 F.3d 900, 904 (5th Cir.1997).</w:t>
+        <w:t xml:space="preserve">Robinson v. TCI/US West Comm'cns Inc.,</w:t>
+      </w:r>
+      <w:r>
+        <w:t xml:space="preserve"> </w:t>
+      </w:r>
+      <w:r>
+        <w:t xml:space="preserve">117 F.3d 900, 904 (5th Cir.1997).</w:t>
       </w:r>
     </w:p>
     <w:p>
@@ -1133,7 +1332,7 @@
         <w:pStyle w:val="Numbered"/>
       </w:pPr>
       <w:r>
-        <w:t xml:space="preserve">16.</w:t>
+        <w:t xml:space="preserve">17.</w:t>
       </w:r>
       <w:r>
         <w:tab/>
@@ -1147,7 +1346,7 @@
         <w:pStyle w:val="Numbered"/>
       </w:pPr>
       <w:r>
-        <w:t xml:space="preserve">17.</w:t>
+        <w:t xml:space="preserve">18.</w:t>
       </w:r>
       <w:r>
         <w:tab/>
@@ -1174,7 +1373,7 @@
         <w:pStyle w:val="Numbered"/>
       </w:pPr>
       <w:r>
-        <w:t xml:space="preserve">18.</w:t>
+        <w:t xml:space="preserve">19.</w:t>
       </w:r>
       <w:r>
         <w:tab/>
@@ -1188,7 +1387,7 @@
         <w:pStyle w:val="Numbered"/>
       </w:pPr>
       <w:r>
-        <w:t xml:space="preserve">19.</w:t>
+        <w:t xml:space="preserve">20.</w:t>
       </w:r>
       <w:r>
         <w:tab/>
@@ -1202,7 +1401,7 @@
         <w:pStyle w:val="Numbered"/>
       </w:pPr>
       <w:r>
-        <w:t xml:space="preserve">20.</w:t>
+        <w:t xml:space="preserve">21.</w:t>
       </w:r>
       <w:r>
         <w:tab/>
@@ -1224,7 +1423,7 @@
         <w:pStyle w:val="Numbered"/>
       </w:pPr>
       <w:r>
-        <w:t xml:space="preserve">21.</w:t>
+        <w:t xml:space="preserve">22.</w:t>
       </w:r>
       <w:r>
         <w:tab/>
@@ -1238,7 +1437,7 @@
         <w:pStyle w:val="Numbered"/>
       </w:pPr>
       <w:r>
-        <w:t xml:space="preserve">22.</w:t>
+        <w:t xml:space="preserve">23.</w:t>
       </w:r>
       <w:r>
         <w:tab/>
@@ -1273,20 +1472,7 @@
         <w:t xml:space="preserve">In re Rowland</w:t>
       </w:r>
       <w:r>
-        <w:t xml:space="preserve">, 275 B.R. 209, 215 (E.D. Penn. 2002) (The deadline in Rule 4007(c) is jurisdictional);</w:t>
-      </w:r>
-      <w:r>
-        <w:t xml:space="preserve"> </w:t>
-      </w:r>
-      <w:r>
-        <w:rPr>
-          <w:i/>
-          <w:iCs/>
-        </w:rPr>
-        <w:t xml:space="preserve">In re Rhodes</w:t>
-      </w:r>
-      <w:r>
-        <w:t xml:space="preserve">, 71 B.R. 206, 208 (9th Cir. BAP 1987) (Bankruptcy court was obligated to dismiss creditor’s complaint under section 523(c) where the creditor filed its complaint one-day late even upon a showing of excusable neglect.)</w:t>
+        <w:t xml:space="preserve">, 275 B.R. 209, 215 (E.D. Penn. 2002) (The deadline in Rule 4007(c) is jurisdictional); In re Rhodes, 71 B.R. 206, 208 (9th Cir. BAP 1987) (Bankruptcy court was obligated to dismiss creditor’s complaint under section 523(c) where the creditor filed its complaint one-day late even upon a showing of excusable neglect.)</w:t>
       </w:r>
     </w:p>
     <w:p>
@@ -1294,7 +1480,7 @@
         <w:pStyle w:val="Numbered"/>
       </w:pPr>
       <w:r>
-        <w:t xml:space="preserve">23.</w:t>
+        <w:t xml:space="preserve">24.</w:t>
       </w:r>
       <w:r>
         <w:tab/>
@@ -1316,7 +1502,15 @@
         <w:pStyle w:val="BlockQuote"/>
       </w:pPr>
       <w:r>
-        <w:t xml:space="preserve">(1) When an Amendment Relates Back. An amendment to a pleading relates back to the date of the original pleading when: (A) the law that provides the applicable statute of limitations allows relation back;</w:t>
+        <w:t xml:space="preserve">(1) When an Amendment Relates Back. An amendment to a pleading relates back to the date of the original pleading when:</w:t>
+      </w:r>
+    </w:p>
+    <w:p>
+      <w:pPr>
+        <w:pStyle w:val="BlockQuote"/>
+      </w:pPr>
+      <w:r>
+        <w:t xml:space="preserve">(A) the law that provides the applicable statute of limitations allows relation back;</w:t>
       </w:r>
     </w:p>
     <w:p>
@@ -1324,7 +1518,7 @@
         <w:pStyle w:val="Numbered"/>
       </w:pPr>
       <w:r>
-        <w:t xml:space="preserve">24.</w:t>
+        <w:t xml:space="preserve">25.</w:t>
       </w:r>
       <w:r>
         <w:tab/>
@@ -1364,7 +1558,7 @@
         <w:pStyle w:val="Numbered"/>
       </w:pPr>
       <w:r>
-        <w:t xml:space="preserve">25.</w:t>
+        <w:t xml:space="preserve">26.</w:t>
       </w:r>
       <w:r>
         <w:tab/>
@@ -1375,112 +1569,43 @@
     </w:p>
     <w:p>
       <w:pPr>
-        <w:pStyle w:val="Unnumbered"/>
-      </w:pPr>
-      <w:r>
-        <w:t xml:space="preserve">For the foregoing reasons, the Defendants respectfully request, pursuant to Federal Rules of Civil Procedure 12(b)(1), that this Court enter an order dismissing the claims and causes of action for relief under 11 U.S.C. §727 objection to the Defendant’s discharge and under 11 U.S.C. §523 to determine the dischargeability of the Plaintiff’s claim as specified in this Motion and grant the Defendants such other and further relief to which they may show themselves justly entitled.</w:t>
-      </w:r>
-    </w:p>
-    <w:p>
-      <w:pPr>
-        <w:pStyle w:val="SignatureFirst"/>
-      </w:pPr>
-      <w:r>
-        <w:t xml:space="preserve">Dated: February 25, 2022</w:t>
+        <w:pStyle w:val="Numbered"/>
+      </w:pPr>
+      <w:r>
+        <w:t xml:space="preserve">27.</w:t>
       </w:r>
       <w:r>
         <w:tab/>
       </w:r>
       <w:r>
-        <w:t xml:space="preserve">Respectfully submitted,</w:t>
-      </w:r>
-    </w:p>
-    <w:p>
-      <w:pPr>
-        <w:pStyle w:val="Signature"/>
-      </w:pPr>
-      <w:r>
-        <w:t xml:space="preserve">QUILLING, SELANDER, LOWNDS,</w:t>
-      </w:r>
-    </w:p>
-    <w:p>
-      <w:pPr>
-        <w:pStyle w:val="Signature"/>
-      </w:pPr>
-      <w:r>
-        <w:t xml:space="preserve">WINSLETT &amp; MOSER, P.C.</w:t>
-      </w:r>
-    </w:p>
-    <w:p>
-      <w:pPr>
-        <w:pStyle w:val="Signature"/>
-      </w:pPr>
-      <w:r>
-        <w:t xml:space="preserve">2001 Bryan Street, Suite 1800</w:t>
-      </w:r>
-    </w:p>
-    <w:p>
-      <w:pPr>
-        <w:pStyle w:val="Signature"/>
-      </w:pPr>
-      <w:r>
-        <w:t xml:space="preserve">Dallas, Texas 75201</w:t>
-      </w:r>
-    </w:p>
-    <w:p>
-      <w:pPr>
-        <w:pStyle w:val="Signature"/>
-      </w:pPr>
-      <w:r>
-        <w:t xml:space="preserve">(214) 880-1851 (Telephone)</w:t>
-      </w:r>
-    </w:p>
-    <w:p>
-      <w:pPr>
-        <w:pStyle w:val="Signature"/>
-      </w:pPr>
-      <w:r>
-        <w:t xml:space="preserve">(214) 871-2111 (Facsimile)</w:t>
-      </w:r>
-    </w:p>
-    <w:p>
-      <w:pPr>
-        <w:pStyle w:val="Signature"/>
-      </w:pPr>
-      <w:r>
-        <w:t xml:space="preserve">By: /s/ John Paul Stanford</w:t>
-      </w:r>
-    </w:p>
-    <w:p>
-      <w:pPr>
-        <w:pStyle w:val="Signature"/>
-      </w:pPr>
-      <w:r>
-        <w:t xml:space="preserve">John Paul Stanford</w:t>
-      </w:r>
-    </w:p>
-    <w:p>
-      <w:pPr>
-        <w:pStyle w:val="Signature"/>
-      </w:pPr>
-      <w:r>
-        <w:t xml:space="preserve">State Bar No. 19037350</w:t>
-      </w:r>
-    </w:p>
-    <w:p>
-      <w:pPr>
-        <w:pStyle w:val="Signature"/>
-      </w:pPr>
-      <w:r>
-        <w:t xml:space="preserve">Email: jstanford@qslwm.com</w:t>
-      </w:r>
-    </w:p>
-    <w:p>
-      <w:pPr>
-        <w:pStyle w:val="Signature"/>
-      </w:pPr>
-      <w:r>
-        <w:t xml:space="preserve">COUNSEL FOR DEFENDANTS</w:t>
+        <w:t xml:space="preserve">&lt;!– unnumbered –&gt;</w:t>
+      </w:r>
+      <w:r>
+        <w:t xml:space="preserve"> </w:t>
+      </w:r>
+      <w:r>
+        <w:rPr>
+          <w:b/>
+          <w:bCs/>
+        </w:rPr>
+        <w:t xml:space="preserve">For the foregoing reasons</w:t>
+      </w:r>
+      <w:r>
+        <w:t xml:space="preserve">, the Defendants respectfully request, pursuant to Federal Rules of Civil Procedure 12(b)(1), that this Court enter an order dismissing the claims and causes of action for relief under 11 U.S.C. §727 objection to the Defendant’s discharge and under 11 U.S.C. §523 to determine the dischargeability of the Plaintiff’s claim as specified in this Motion and grant the Defendants such other and further relief to which they may show themselves justly entitled.</w:t>
+      </w:r>
+    </w:p>
+    <w:p>
+      <w:pPr>
+        <w:pStyle w:val="Numbered"/>
+      </w:pPr>
+      <w:r>
+        <w:t xml:space="preserve">28.</w:t>
+      </w:r>
+      <w:r>
+        <w:tab/>
+      </w:r>
+      <w:r>
+        <w:t xml:space="preserve">&lt;!– signature –&gt;</w:t>
       </w:r>
     </w:p>
     <w:p>
@@ -1493,50 +1618,62 @@
     </w:p>
     <w:p>
       <w:pPr>
-        <w:pStyle w:val="Unnumbered"/>
-      </w:pPr>
-      <w:r>
-        <w:t xml:space="preserve">The undersigned hereby certifies that on the 25th day of February 2022, a true and correct copy of the foregoing pleading was served by electronic transmission via the Court’s CM/ECF system upon all parties registered to receive electronic notice in this adversary proceeding and upon the counsel for Plaintiff.</w:t>
-      </w:r>
-    </w:p>
-    <w:p>
-      <w:pPr>
-        <w:pStyle w:val="AddressLine"/>
-      </w:pPr>
-      <w:r>
-        <w:t xml:space="preserve">William C. Little</w:t>
-      </w:r>
-    </w:p>
-    <w:p>
-      <w:pPr>
-        <w:pStyle w:val="AddressLine"/>
-      </w:pPr>
+        <w:pStyle w:val="Numbered"/>
+      </w:pPr>
+      <w:r>
+        <w:t xml:space="preserve">29.</w:t>
+      </w:r>
+      <w:r>
+        <w:tab/>
+      </w:r>
+      <w:r>
+        <w:t xml:space="preserve">&lt;!– unnumbered –&gt; The undersigned hereby certifies that on the 25th day of February 2022, a true and correct copy of the foregoing pleading was served by electronic transmission via the Court’s CM/ECF system upon all parties registered to receive electronic notice in this adversary proceeding and upon the counsel for Plaintiff.</w:t>
+      </w:r>
+    </w:p>
+    <w:p>
+      <w:pPr>
+        <w:pStyle w:val="Numbered"/>
+      </w:pPr>
+      <w:r>
+        <w:t xml:space="preserve">30.</w:t>
+      </w:r>
+      <w:r>
+        <w:tab/>
+      </w:r>
+      <w:r>
+        <w:t xml:space="preserve">&lt;!– flush –&gt; William C. Little</w:t>
+      </w:r>
+      <w:r>
+        <w:t xml:space="preserve"> </w:t>
+      </w:r>
       <w:r>
         <w:t xml:space="preserve">Little &amp; McCool, P.C.</w:t>
       </w:r>
-    </w:p>
-    <w:p>
-      <w:pPr>
-        <w:pStyle w:val="AddressLine"/>
-      </w:pPr>
+      <w:r>
+        <w:t xml:space="preserve"> </w:t>
+      </w:r>
       <w:r>
         <w:t xml:space="preserve">301 Main Plaza #372</w:t>
       </w:r>
-    </w:p>
-    <w:p>
-      <w:pPr>
-        <w:pStyle w:val="AddressLine"/>
-      </w:pPr>
+      <w:r>
+        <w:t xml:space="preserve"> </w:t>
+      </w:r>
       <w:r>
         <w:t xml:space="preserve">New Braunfels, Texas 78130</w:t>
       </w:r>
     </w:p>
     <w:p>
       <w:pPr>
-        <w:pStyle w:val="SignatureLine"/>
-      </w:pPr>
-      <w:r>
-        <w:t xml:space="preserve">/s/ John Paul Stanford</w:t>
+        <w:pStyle w:val="Numbered"/>
+      </w:pPr>
+      <w:r>
+        <w:t xml:space="preserve">31.</w:t>
+      </w:r>
+      <w:r>
+        <w:tab/>
+      </w:r>
+      <w:r>
+        <w:t xml:space="preserve">&lt;!– right –&gt; /s/ John Paul Stanford</w:t>
       </w:r>
     </w:p>
     <w:sectPr>

</xml_diff>